<commit_message>
refactor: melhorando novo cv
</commit_message>
<xml_diff>
--- a/public/Yuri_Melo_dos_Santos.docx
+++ b/public/Yuri_Melo_dos_Santos.docx
@@ -490,7 +490,7 @@
           <w:sz w:val="20"/>
           <w:szCs w:val="20"/>
         </w:rPr>
-        <w:t>, C#/.NET e Java/Spring Boot em sistemas reais de gestão organizacional, sites institucionais e aplicações com autenticação, tempo real e integração com bancos de dados.</w:t>
+        <w:t>, Node.js, C#/.NET e Java/Spring Boot em sistemas de gestão organizacional, sites institucionais e aplicações com autenticação, integrações, tempo real e bancos de dados.</w:t>
       </w:r>
     </w:p>
     <w:p>
@@ -2428,6 +2428,7 @@
         <w:rPr>
           <w:sz w:val="20"/>
           <w:szCs w:val="20"/>
+          <w:lang w:val="en-US"/>
         </w:rPr>
       </w:pPr>
     </w:p>
@@ -2528,7 +2529,7 @@
           <w:sz w:val="20"/>
           <w:szCs w:val="20"/>
         </w:rPr>
-        <w:t>Desenvolvimento da aplicação com Next.js no front-</w:t>
+        <w:t xml:space="preserve">Desenvolvimento </w:t>
       </w:r>
       <w:proofErr w:type="spellStart"/>
       <w:r>
@@ -2538,6 +2539,26 @@
           <w:sz w:val="20"/>
           <w:szCs w:val="20"/>
         </w:rPr>
+        <w:t>full-stack</w:t>
+      </w:r>
+      <w:proofErr w:type="spellEnd"/>
+      <w:r>
+        <w:rPr>
+          <w:rFonts w:ascii="Times New Roman" w:eastAsia="Times New Roman" w:hAnsi="Times New Roman" w:cs="Times New Roman"/>
+          <w:color w:val="000000" w:themeColor="text1"/>
+          <w:sz w:val="20"/>
+          <w:szCs w:val="20"/>
+        </w:rPr>
+        <w:t xml:space="preserve"> da aplicação com Next.js no front-</w:t>
+      </w:r>
+      <w:proofErr w:type="spellStart"/>
+      <w:r>
+        <w:rPr>
+          <w:rFonts w:ascii="Times New Roman" w:eastAsia="Times New Roman" w:hAnsi="Times New Roman" w:cs="Times New Roman"/>
+          <w:color w:val="000000" w:themeColor="text1"/>
+          <w:sz w:val="20"/>
+          <w:szCs w:val="20"/>
+        </w:rPr>
         <w:t>end</w:t>
       </w:r>
       <w:proofErr w:type="spellEnd"/>
@@ -2568,7 +2589,7 @@
           <w:sz w:val="20"/>
           <w:szCs w:val="20"/>
         </w:rPr>
-        <w:t xml:space="preserve"> no </w:t>
+        <w:t xml:space="preserve">/Node.js no </w:t>
       </w:r>
       <w:proofErr w:type="spellStart"/>
       <w:r>
@@ -2578,7 +2599,7 @@
           <w:sz w:val="20"/>
           <w:szCs w:val="20"/>
         </w:rPr>
-        <w:t>back</w:t>
+        <w:t>back-end</w:t>
       </w:r>
       <w:proofErr w:type="spellEnd"/>
       <w:r>
@@ -2588,7 +2609,27 @@
           <w:sz w:val="20"/>
           <w:szCs w:val="20"/>
         </w:rPr>
-        <w:t xml:space="preserve">-end. </w:t>
+        <w:t xml:space="preserve">, criando interfaces responsivas, APIs REST e </w:t>
+      </w:r>
+      <w:proofErr w:type="spellStart"/>
+      <w:r>
+        <w:rPr>
+          <w:rFonts w:ascii="Times New Roman" w:eastAsia="Times New Roman" w:hAnsi="Times New Roman" w:cs="Times New Roman"/>
+          <w:color w:val="000000" w:themeColor="text1"/>
+          <w:sz w:val="20"/>
+          <w:szCs w:val="20"/>
+        </w:rPr>
+        <w:t>endpoints</w:t>
+      </w:r>
+      <w:proofErr w:type="spellEnd"/>
+      <w:r>
+        <w:rPr>
+          <w:rFonts w:ascii="Times New Roman" w:eastAsia="Times New Roman" w:hAnsi="Times New Roman" w:cs="Times New Roman"/>
+          <w:color w:val="000000" w:themeColor="text1"/>
+          <w:sz w:val="20"/>
+          <w:szCs w:val="20"/>
+        </w:rPr>
+        <w:t xml:space="preserve"> para gerenciamento de produtos, pedidos e usuários.</w:t>
       </w:r>
     </w:p>
     <w:p>
@@ -3478,6 +3519,7 @@
           <w:spacing w:val="14"/>
           <w:sz w:val="20"/>
           <w:szCs w:val="20"/>
+          <w:lang w:val="en-US"/>
         </w:rPr>
         <w:t>TECNOLOGIAS E FERRAMENTAS</w:t>
       </w:r>

</xml_diff>